<commit_message>
Protocol: second round of PI text edits; Word spacing and list fix
Text edits from the second review of the Word render merged into the
QMD (same 0.4.1 entry; history description updated). The edited .docx is
kept under docs/protocol/source/.

The "STROBE: Potential bias" placeholder sat between two items of a
nested list, so Pandoc turned the remaining items into an indented code
block (literal ** and hard-wrapped text in Word). The placeholder now
follows the list, combined with the STRESS tag.

New docs/protocol/protocol.css layers spacing over the base theme: more
space above level-1 and level-2 headings, space before and after the
reporting-guideline blockquotes, and a Dateline paragraph style
(custom-style div) for the date and version line under the title.
</commit_message>
<xml_diff>
--- a/docs/protocol/_docstyle/reference.docx
+++ b/docs/protocol/_docstyle/reference.docx
@@ -431,6 +431,7 @@
       <w:i/>
     </w:rPr>
     <w:pPr>
+      <w:spacing w:before="160" w:after="160"/>
       <w:pBdr>
         <w:left w:val="single" w:sz="24" w:space="0" w:color="262C3A"/>
       </w:pBdr>
@@ -548,6 +549,7 @@
       <w:keepNext/>
       <w:keepLines/>
       <w:outlineLvl w:val="0"/>
+      <w:spacing w:before="480" w:after="120"/>
     </w:pPr>
     <w:rPr>
       <w:rFonts w:ascii="Libre Baskerville" w:hAnsi="Libre Baskerville" w:cs="Libre Baskerville"/>
@@ -568,6 +570,7 @@
       <w:keepNext/>
       <w:keepLines/>
       <w:outlineLvl w:val="1"/>
+      <w:spacing w:before="320" w:after="80"/>
     </w:pPr>
     <w:rPr>
       <w:rFonts w:ascii="Libre Baskerville" w:hAnsi="Libre Baskerville" w:cs="Libre Baskerville"/>
@@ -1137,6 +1140,13 @@
         <w:bottom w:val="single" w:sz="12" w:space="0" w:color="FFC107"/>
       </w:pBdr>
       <w:shd w:val="clear" w:color="auto" w:fill="FFF3CD"/>
+    </w:pPr>
+  </w:style>
+  <w:style w:type="paragraph" w:styleId="dateline">
+    <w:name w:val="Dateline"/>
+    <w:pPr>
+      <w:jc w:val="center"/>
+      <w:spacing w:before="240" w:after="240"/>
     </w:pPr>
   </w:style>
 </w:styles>

</xml_diff>